<commit_message>
Form 4 first sequence: wave-action question reworded in GCE style
Co-Authored-By: Claude Opus 5.5 <noreply@anthropic.com>
Claude-Session: https://claude.ai/code/session_0115LFSb2ktGLWPeVksFkSer
</commit_message>
<xml_diff>
--- a/epreuves/2026-2027/Sequence_1/F4_Geography_Seq1_2026-2027.docx
+++ b/epreuves/2026-2027/Sequence_1/F4_Geography_Seq1_2026-2027.docx
@@ -1669,7 +1669,25 @@
           <w:sz w:val="24"/>
           <w:szCs w:val="24"/>
         </w:rPr>
-        <w:t xml:space="preserve">(a)	What are destructive (erosive) waves? </w:t>
+        <w:t xml:space="preserve">(a)	State </w:t>
+      </w:r>
+      <w:r>
+        <w:rPr>
+          <w:rFonts w:ascii="Times New Roman" w:cs="Times New Roman" w:eastAsia="Times New Roman" w:hAnsi="Times New Roman"/>
+          <w:b/>
+          <w:bCs/>
+          <w:sz w:val="24"/>
+          <w:szCs w:val="24"/>
+        </w:rPr>
+        <w:t xml:space="preserve">two</w:t>
+      </w:r>
+      <w:r>
+        <w:rPr>
+          <w:rFonts w:ascii="Times New Roman" w:cs="Times New Roman" w:eastAsia="Times New Roman" w:hAnsi="Times New Roman"/>
+          <w:sz w:val="24"/>
+          <w:szCs w:val="24"/>
+        </w:rPr>
+        <w:t xml:space="preserve"> characteristics of destructive waves. </w:t>
       </w:r>
       <w:r>
         <w:rPr>
@@ -1697,7 +1715,17 @@
           <w:sz w:val="24"/>
           <w:szCs w:val="24"/>
         </w:rPr>
-        <w:t xml:space="preserve">(b)	With the aid of well-labelled diagrams, explain the formation of the following features of wave erosion and deposition:</w:t>
+        <w:t xml:space="preserve">(b)	With the aid of a well-labelled diagram, explain how a cliff is formed and why it retreats inland. </w:t>
+      </w:r>
+      <w:r>
+        <w:rPr>
+          <w:rFonts w:ascii="Times New Roman" w:cs="Times New Roman" w:eastAsia="Times New Roman" w:hAnsi="Times New Roman"/>
+          <w:b/>
+          <w:bCs/>
+          <w:sz w:val="24"/>
+          <w:szCs w:val="24"/>
+        </w:rPr>
+        <w:t xml:space="preserve">(3 marks)</w:t>
       </w:r>
     </w:p>
     <w:p>
@@ -1707,15 +1735,15 @@
           <w:tab w:val="left" w:pos="1500"/>
         </w:tabs>
         <w:spacing w:after="70" w:line="300"/>
-        <w:ind w:left="1500" w:hanging="1100"/>
-      </w:pPr>
-      <w:r>
-        <w:rPr>
-          <w:rFonts w:ascii="Times New Roman" w:cs="Times New Roman" w:eastAsia="Times New Roman" w:hAnsi="Times New Roman"/>
-          <w:sz w:val="24"/>
-          <w:szCs w:val="24"/>
-        </w:rPr>
-        <w:t xml:space="preserve">	(i)	A cliff; </w:t>
+        <w:ind w:left="1000" w:hanging="600"/>
+      </w:pPr>
+      <w:r>
+        <w:rPr>
+          <w:rFonts w:ascii="Times New Roman" w:cs="Times New Roman" w:eastAsia="Times New Roman" w:hAnsi="Times New Roman"/>
+          <w:sz w:val="24"/>
+          <w:szCs w:val="24"/>
+        </w:rPr>
+        <w:t xml:space="preserve">(c)	Describe the stages through which a headland is eroded to form a stack. Illustrate your answer with diagrams. </w:t>
       </w:r>
       <w:r>
         <w:rPr>
@@ -1735,43 +1763,15 @@
           <w:tab w:val="left" w:pos="1500"/>
         </w:tabs>
         <w:spacing w:after="70" w:line="300"/>
-        <w:ind w:left="1500" w:hanging="1100"/>
-      </w:pPr>
-      <w:r>
-        <w:rPr>
-          <w:rFonts w:ascii="Times New Roman" w:cs="Times New Roman" w:eastAsia="Times New Roman" w:hAnsi="Times New Roman"/>
-          <w:sz w:val="24"/>
-          <w:szCs w:val="24"/>
-        </w:rPr>
-        <w:t xml:space="preserve">	(ii)	A stack; </w:t>
-      </w:r>
-      <w:r>
-        <w:rPr>
-          <w:rFonts w:ascii="Times New Roman" w:cs="Times New Roman" w:eastAsia="Times New Roman" w:hAnsi="Times New Roman"/>
-          <w:b/>
-          <w:bCs/>
-          <w:sz w:val="24"/>
-          <w:szCs w:val="24"/>
-        </w:rPr>
-        <w:t xml:space="preserve">(3 marks)</w:t>
-      </w:r>
-    </w:p>
-    <w:p>
-      <w:pPr>
-        <w:tabs>
-          <w:tab w:val="left" w:pos="1000"/>
-          <w:tab w:val="left" w:pos="1500"/>
-        </w:tabs>
-        <w:spacing w:after="70" w:line="300"/>
-        <w:ind w:left="1500" w:hanging="1100"/>
-      </w:pPr>
-      <w:r>
-        <w:rPr>
-          <w:rFonts w:ascii="Times New Roman" w:cs="Times New Roman" w:eastAsia="Times New Roman" w:hAnsi="Times New Roman"/>
-          <w:sz w:val="24"/>
-          <w:szCs w:val="24"/>
-        </w:rPr>
-        <w:t xml:space="preserve">	(iii)	A spit. </w:t>
+        <w:ind w:left="1000" w:hanging="600"/>
+      </w:pPr>
+      <w:r>
+        <w:rPr>
+          <w:rFonts w:ascii="Times New Roman" w:cs="Times New Roman" w:eastAsia="Times New Roman" w:hAnsi="Times New Roman"/>
+          <w:sz w:val="24"/>
+          <w:szCs w:val="24"/>
+        </w:rPr>
+        <w:t xml:space="preserve">(d)	Explain how longshore drift leads to the formation of a spit. </w:t>
       </w:r>
       <w:r>
         <w:rPr>

</xml_diff>